<commit_message>
Added meeting minutes from 26.03 - 16.04
</commit_message>
<xml_diff>
--- a/Non project files/Meeting minutes/20.03.26 Stockle Meeting.docx
+++ b/Non project files/Meeting minutes/20.03.26 Stockle Meeting.docx
@@ -103,6 +103,14 @@
               </w:rPr>
               <w:t>:</w:t>
             </w:r>
+            <w:r>
+              <w:rPr>
+                <w:b/>
+                <w:sz w:val="28"/>
+                <w:szCs w:val="28"/>
+              </w:rPr>
+              <w:t xml:space="preserve"> James</w:t>
+            </w:r>
           </w:p>
           <w:p>
             <w:pPr>
@@ -137,6 +145,14 @@
               </w:rPr>
               <w:t>Minutes:</w:t>
             </w:r>
+            <w:r>
+              <w:rPr>
+                <w:b/>
+                <w:sz w:val="28"/>
+                <w:szCs w:val="28"/>
+              </w:rPr>
+              <w:t xml:space="preserve"> </w:t>
+            </w:r>
           </w:p>
           <w:p>
             <w:pPr>
@@ -171,15 +187,31 @@
               </w:rPr>
               <w:t>Date &amp; Time:</w:t>
             </w:r>
-          </w:p>
-          <w:p>
-            <w:pPr>
-              <w:rPr>
-                <w:b/>
-                <w:sz w:val="28"/>
-                <w:szCs w:val="28"/>
-              </w:rPr>
-            </w:pPr>
+            <w:r>
+              <w:rPr>
+                <w:b/>
+                <w:sz w:val="28"/>
+                <w:szCs w:val="28"/>
+              </w:rPr>
+              <w:t xml:space="preserve"> 20/03 </w:t>
+            </w:r>
+          </w:p>
+          <w:p>
+            <w:pPr>
+              <w:rPr>
+                <w:b/>
+                <w:sz w:val="28"/>
+                <w:szCs w:val="28"/>
+              </w:rPr>
+            </w:pPr>
+            <w:r>
+              <w:rPr>
+                <w:b/>
+                <w:sz w:val="28"/>
+                <w:szCs w:val="28"/>
+              </w:rPr>
+              <w:t>During practical</w:t>
+            </w:r>
           </w:p>
         </w:tc>
         <w:tc>
@@ -204,6 +236,14 @@
                 <w:szCs w:val="28"/>
               </w:rPr>
               <w:t>Location:</w:t>
+            </w:r>
+            <w:r>
+              <w:rPr>
+                <w:b/>
+                <w:sz w:val="28"/>
+                <w:szCs w:val="28"/>
+              </w:rPr>
+              <w:t xml:space="preserve"> O303</w:t>
             </w:r>
           </w:p>
           <w:p>
@@ -641,13 +681,35 @@
               </w:rPr>
               <w:t>:</w:t>
             </w:r>
-          </w:p>
-          <w:p>
-            <w:pPr>
-              <w:rPr>
-                <w:b/>
-              </w:rPr>
-            </w:pPr>
+            <w:r>
+              <w:rPr>
+                <w:b/>
+                <w:sz w:val="28"/>
+                <w:szCs w:val="28"/>
+              </w:rPr>
+              <w:t xml:space="preserve"> </w:t>
+            </w:r>
+            <w:r>
+              <w:rPr>
+                <w:b/>
+                <w:sz w:val="28"/>
+                <w:szCs w:val="28"/>
+              </w:rPr>
+              <w:t>None</w:t>
+            </w:r>
+          </w:p>
+          <w:p>
+            <w:pPr>
+              <w:rPr>
+                <w:b/>
+              </w:rPr>
+            </w:pPr>
+            <w:r>
+              <w:rPr>
+                <w:b/>
+              </w:rPr>
+              <w:t xml:space="preserve"> </w:t>
+            </w:r>
           </w:p>
         </w:tc>
       </w:tr>
@@ -1011,10 +1073,7 @@
           </w:tcPr>
           <w:p>
             <w:r>
-              <w:t>Creation of Figma design</w:t>
-            </w:r>
-            <w:r>
-              <w:t xml:space="preserve"> </w:t>
+              <w:t xml:space="preserve">Creation of Figma design </w:t>
             </w:r>
           </w:p>
         </w:tc>
@@ -1030,7 +1089,11 @@
             <w:tcW w:w="2109" w:type="dxa"/>
             <w:gridSpan w:val="2"/>
           </w:tcPr>
-          <w:p/>
+          <w:p>
+            <w:r>
+              <w:t>To be discussed</w:t>
+            </w:r>
+          </w:p>
         </w:tc>
         <w:tc>
           <w:tcPr>
@@ -1117,14 +1180,22 @@
             <w:tcW w:w="5288" w:type="dxa"/>
             <w:gridSpan w:val="2"/>
           </w:tcPr>
-          <w:p/>
+          <w:p>
+            <w:r>
+              <w:t>Each add at least 4 user stories</w:t>
+            </w:r>
+          </w:p>
         </w:tc>
         <w:tc>
           <w:tcPr>
             <w:tcW w:w="2109" w:type="dxa"/>
             <w:gridSpan w:val="2"/>
           </w:tcPr>
-          <w:p/>
+          <w:p>
+            <w:r>
+              <w:t>All</w:t>
+            </w:r>
+          </w:p>
         </w:tc>
         <w:tc>
           <w:tcPr>
@@ -1162,14 +1233,30 @@
             <w:tcW w:w="5288" w:type="dxa"/>
             <w:gridSpan w:val="2"/>
           </w:tcPr>
-          <w:p/>
+          <w:p>
+            <w:r>
+              <w:t xml:space="preserve">Someone </w:t>
+            </w:r>
+            <w:proofErr w:type="gramStart"/>
+            <w:r>
+              <w:t>fill</w:t>
+            </w:r>
+            <w:proofErr w:type="gramEnd"/>
+            <w:r>
+              <w:t xml:space="preserve"> out the project brief</w:t>
+            </w:r>
+          </w:p>
         </w:tc>
         <w:tc>
           <w:tcPr>
             <w:tcW w:w="2109" w:type="dxa"/>
             <w:gridSpan w:val="2"/>
           </w:tcPr>
-          <w:p/>
+          <w:p>
+            <w:r>
+              <w:t>Jackson, Ethan</w:t>
+            </w:r>
+          </w:p>
         </w:tc>
         <w:tc>
           <w:tcPr>
@@ -1207,14 +1294,30 @@
             <w:tcW w:w="5288" w:type="dxa"/>
             <w:gridSpan w:val="2"/>
           </w:tcPr>
-          <w:p/>
+          <w:p>
+            <w:r>
+              <w:t xml:space="preserve">Everyone </w:t>
+            </w:r>
+            <w:proofErr w:type="gramStart"/>
+            <w:r>
+              <w:t>complete</w:t>
+            </w:r>
+            <w:proofErr w:type="gramEnd"/>
+            <w:r>
+              <w:t xml:space="preserve"> all 4</w:t>
+            </w:r>
+          </w:p>
         </w:tc>
         <w:tc>
           <w:tcPr>
             <w:tcW w:w="2109" w:type="dxa"/>
             <w:gridSpan w:val="2"/>
           </w:tcPr>
-          <w:p/>
+          <w:p>
+            <w:r>
+              <w:t>All</w:t>
+            </w:r>
+          </w:p>
         </w:tc>
         <w:tc>
           <w:tcPr>
@@ -1241,14 +1344,30 @@
           <w:tcPr>
             <w:tcW w:w="4167" w:type="dxa"/>
           </w:tcPr>
-          <w:p/>
+          <w:p>
+            <w:r>
+              <w:t xml:space="preserve">Next meeting </w:t>
+            </w:r>
+            <w:proofErr w:type="gramStart"/>
+            <w:r>
+              <w:t>organise</w:t>
+            </w:r>
+            <w:proofErr w:type="gramEnd"/>
+            <w:r>
+              <w:t xml:space="preserve"> user stories</w:t>
+            </w:r>
+          </w:p>
         </w:tc>
         <w:tc>
           <w:tcPr>
             <w:tcW w:w="5288" w:type="dxa"/>
             <w:gridSpan w:val="2"/>
           </w:tcPr>
-          <w:p/>
+          <w:p>
+            <w:r>
+              <w:t>Categorise and give stories time estimates</w:t>
+            </w:r>
+          </w:p>
         </w:tc>
         <w:tc>
           <w:tcPr>

</xml_diff>